<commit_message>
Simplifica evidencias de Fase 1 y actualiza PPT e individuales backend
</commit_message>
<xml_diff>
--- a/Fase1/Evidencias_individuales/Tsung-Hao_Liu_1.1_Autoevaluacion_Competencias_Fase1.docx
+++ b/Fase1/Evidencias_individuales/Tsung-Hao_Liu_1.1_Autoevaluacion_Competencias_Fase1.docx
@@ -1266,6 +1266,9 @@
             <w:vAlign w:val="center"/>
           </w:tcPr>
           <w:p>
+            <w:pPr>
+              <w:spacing w:after="0"/>
+            </w:pPr>
             <w:r>
               <w:rPr>
                 <w:rFonts w:ascii="Arial" w:hAnsi="Arial"/>
@@ -1284,6 +1287,7 @@
           </w:tcPr>
           <w:p>
             <w:pPr>
+              <w:spacing w:after="0"/>
               <w:jc w:val="center"/>
             </w:pPr>
           </w:p>
@@ -1295,6 +1299,7 @@
           </w:tcPr>
           <w:p>
             <w:pPr>
+              <w:spacing w:after="0"/>
               <w:jc w:val="center"/>
             </w:pPr>
             <w:r>
@@ -1315,6 +1320,7 @@
           </w:tcPr>
           <w:p>
             <w:pPr>
+              <w:spacing w:after="0"/>
               <w:jc w:val="center"/>
             </w:pPr>
           </w:p>
@@ -1326,6 +1332,7 @@
           </w:tcPr>
           <w:p>
             <w:pPr>
+              <w:spacing w:after="0"/>
               <w:jc w:val="center"/>
             </w:pPr>
           </w:p>
@@ -1337,6 +1344,7 @@
           </w:tcPr>
           <w:p>
             <w:pPr>
+              <w:spacing w:after="0"/>
               <w:jc w:val="center"/>
             </w:pPr>
           </w:p>
@@ -1347,10 +1355,16 @@
             <w:vAlign w:val="center"/>
           </w:tcPr>
           <w:p>
+            <w:pPr>
+              <w:spacing w:after="0"/>
+            </w:pPr>
             <w:r>
               <w:rPr>
                 <w:rFonts w:ascii="Arial" w:hAnsi="Arial"/>
-                <w:sz w:val="15"/>
+                <w:b w:val="0"/>
+                <w:i w:val="0"/>
+                <w:color w:val="17212B"/>
+                <w:sz w:val="16"/>
               </w:rPr>
               <w:t>Analizo necesidades y propongo alternativas viables; debo mejorar la estimación de costos y la comparación formal de opciones.</w:t>
             </w:r>
@@ -1368,6 +1382,9 @@
             <w:vAlign w:val="center"/>
           </w:tcPr>
           <w:p>
+            <w:pPr>
+              <w:spacing w:after="0"/>
+            </w:pPr>
             <w:r>
               <w:rPr>
                 <w:rFonts w:ascii="Arial" w:hAnsi="Arial"/>
@@ -1386,6 +1403,7 @@
           </w:tcPr>
           <w:p>
             <w:pPr>
+              <w:spacing w:after="0"/>
               <w:jc w:val="center"/>
             </w:pPr>
           </w:p>
@@ -1397,6 +1415,7 @@
           </w:tcPr>
           <w:p>
             <w:pPr>
+              <w:spacing w:after="0"/>
               <w:jc w:val="center"/>
             </w:pPr>
             <w:r>
@@ -1417,6 +1436,7 @@
           </w:tcPr>
           <w:p>
             <w:pPr>
+              <w:spacing w:after="0"/>
               <w:jc w:val="center"/>
             </w:pPr>
           </w:p>
@@ -1428,6 +1448,7 @@
           </w:tcPr>
           <w:p>
             <w:pPr>
+              <w:spacing w:after="0"/>
               <w:jc w:val="center"/>
             </w:pPr>
           </w:p>
@@ -1439,6 +1460,7 @@
           </w:tcPr>
           <w:p>
             <w:pPr>
+              <w:spacing w:after="0"/>
               <w:jc w:val="center"/>
             </w:pPr>
           </w:p>
@@ -1449,12 +1471,18 @@
             <w:vAlign w:val="center"/>
           </w:tcPr>
           <w:p>
+            <w:pPr>
+              <w:spacing w:after="0"/>
+            </w:pPr>
             <w:r>
               <w:rPr>
                 <w:rFonts w:ascii="Arial" w:hAnsi="Arial"/>
-                <w:sz w:val="15"/>
+                <w:b w:val="0"/>
+                <w:i w:val="0"/>
+                <w:color w:val="17212B"/>
+                <w:sz w:val="16"/>
               </w:rPr>
-              <w:t>Integro frontend y backend en aplicaciones web; debo reforzar pruebas automatizadas y documentación técnica.</w:t>
+              <w:t>Puedo construir servicios backend para aplicaciones web; debo reforzar pruebas automatizadas, documentación técnica y manejo consistente de errores.</w:t>
             </w:r>
           </w:p>
         </w:tc>
@@ -1470,6 +1498,9 @@
             <w:vAlign w:val="center"/>
           </w:tcPr>
           <w:p>
+            <w:pPr>
+              <w:spacing w:after="0"/>
+            </w:pPr>
             <w:r>
               <w:rPr>
                 <w:rFonts w:ascii="Arial" w:hAnsi="Arial"/>
@@ -1488,6 +1519,7 @@
           </w:tcPr>
           <w:p>
             <w:pPr>
+              <w:spacing w:after="0"/>
               <w:jc w:val="center"/>
             </w:pPr>
           </w:p>
@@ -1499,6 +1531,7 @@
           </w:tcPr>
           <w:p>
             <w:pPr>
+              <w:spacing w:after="0"/>
               <w:jc w:val="center"/>
             </w:pPr>
           </w:p>
@@ -1510,6 +1543,7 @@
           </w:tcPr>
           <w:p>
             <w:pPr>
+              <w:spacing w:after="0"/>
               <w:jc w:val="center"/>
             </w:pPr>
             <w:r>
@@ -1530,6 +1564,7 @@
           </w:tcPr>
           <w:p>
             <w:pPr>
+              <w:spacing w:after="0"/>
               <w:jc w:val="center"/>
             </w:pPr>
           </w:p>
@@ -1541,6 +1576,7 @@
           </w:tcPr>
           <w:p>
             <w:pPr>
+              <w:spacing w:after="0"/>
               <w:jc w:val="center"/>
             </w:pPr>
           </w:p>
@@ -1551,12 +1587,18 @@
             <w:vAlign w:val="center"/>
           </w:tcPr>
           <w:p>
+            <w:pPr>
+              <w:spacing w:after="0"/>
+            </w:pPr>
             <w:r>
               <w:rPr>
                 <w:rFonts w:ascii="Arial" w:hAnsi="Arial"/>
-                <w:sz w:val="15"/>
+                <w:b w:val="0"/>
+                <w:i w:val="0"/>
+                <w:color w:val="17212B"/>
+                <w:sz w:val="16"/>
               </w:rPr>
-              <w:t>Diseño estructuras de datos funcionales; necesito practicar escalabilidad, índices y normalización.</w:t>
+              <w:t>Diseño estructuras de datos funcionales; necesito practicar escalabilidad, índices, normalización y adaptación a modelos existentes.</w:t>
             </w:r>
           </w:p>
         </w:tc>
@@ -1572,6 +1614,9 @@
             <w:vAlign w:val="center"/>
           </w:tcPr>
           <w:p>
+            <w:pPr>
+              <w:spacing w:after="0"/>
+            </w:pPr>
             <w:r>
               <w:rPr>
                 <w:rFonts w:ascii="Arial" w:hAnsi="Arial"/>
@@ -1590,6 +1635,7 @@
           </w:tcPr>
           <w:p>
             <w:pPr>
+              <w:spacing w:after="0"/>
               <w:jc w:val="center"/>
             </w:pPr>
           </w:p>
@@ -1601,6 +1647,7 @@
           </w:tcPr>
           <w:p>
             <w:pPr>
+              <w:spacing w:after="0"/>
               <w:jc w:val="center"/>
             </w:pPr>
           </w:p>
@@ -1612,6 +1659,7 @@
           </w:tcPr>
           <w:p>
             <w:pPr>
+              <w:spacing w:after="0"/>
               <w:jc w:val="center"/>
             </w:pPr>
             <w:r>
@@ -1632,6 +1680,7 @@
           </w:tcPr>
           <w:p>
             <w:pPr>
+              <w:spacing w:after="0"/>
               <w:jc w:val="center"/>
             </w:pPr>
           </w:p>
@@ -1643,6 +1692,7 @@
           </w:tcPr>
           <w:p>
             <w:pPr>
+              <w:spacing w:after="0"/>
               <w:jc w:val="center"/>
             </w:pPr>
           </w:p>
@@ -1653,12 +1703,18 @@
             <w:vAlign w:val="center"/>
           </w:tcPr>
           <w:p>
+            <w:pPr>
+              <w:spacing w:after="0"/>
+            </w:pPr>
             <w:r>
               <w:rPr>
                 <w:rFonts w:ascii="Arial" w:hAnsi="Arial"/>
-                <w:sz w:val="15"/>
+                <w:b w:val="0"/>
+                <w:i w:val="0"/>
+                <w:color w:val="17212B"/>
+                <w:sz w:val="16"/>
               </w:rPr>
-              <w:t>Realizo operaciones CRUD e integración con bases de datos; debo mejorar consultas complejas, optimización y concurrencia.</w:t>
+              <w:t>Realizo operaciones CRUD e integración básica con bases de datos; debo mejorar consultas complejas, optimización y concurrencia.</w:t>
             </w:r>
           </w:p>
         </w:tc>
@@ -1674,6 +1730,9 @@
             <w:vAlign w:val="center"/>
           </w:tcPr>
           <w:p>
+            <w:pPr>
+              <w:spacing w:after="0"/>
+            </w:pPr>
             <w:r>
               <w:rPr>
                 <w:rFonts w:ascii="Arial" w:hAnsi="Arial"/>
@@ -1692,6 +1751,7 @@
           </w:tcPr>
           <w:p>
             <w:pPr>
+              <w:spacing w:after="0"/>
               <w:jc w:val="center"/>
             </w:pPr>
           </w:p>
@@ -1703,6 +1763,7 @@
           </w:tcPr>
           <w:p>
             <w:pPr>
+              <w:spacing w:after="0"/>
               <w:jc w:val="center"/>
             </w:pPr>
             <w:r>
@@ -1723,6 +1784,7 @@
           </w:tcPr>
           <w:p>
             <w:pPr>
+              <w:spacing w:after="0"/>
               <w:jc w:val="center"/>
             </w:pPr>
           </w:p>
@@ -1734,6 +1796,7 @@
           </w:tcPr>
           <w:p>
             <w:pPr>
+              <w:spacing w:after="0"/>
               <w:jc w:val="center"/>
             </w:pPr>
           </w:p>
@@ -1745,6 +1808,7 @@
           </w:tcPr>
           <w:p>
             <w:pPr>
+              <w:spacing w:after="0"/>
               <w:jc w:val="center"/>
             </w:pPr>
           </w:p>
@@ -1755,12 +1819,18 @@
             <w:vAlign w:val="center"/>
           </w:tcPr>
           <w:p>
+            <w:pPr>
+              <w:spacing w:after="0"/>
+            </w:pPr>
             <w:r>
               <w:rPr>
                 <w:rFonts w:ascii="Arial" w:hAnsi="Arial"/>
-                <w:sz w:val="15"/>
+                <w:b w:val="0"/>
+                <w:i w:val="0"/>
+                <w:color w:val="17212B"/>
+                <w:sz w:val="16"/>
               </w:rPr>
-              <w:t>Construyo componentes y servicios modulares con control de versiones; debo reforzar patrones de diseño y revisión de código.</w:t>
+              <w:t>Programo componentes y servicios modulares con control de versiones; debo reforzar patrones de diseño y revisión de código.</w:t>
             </w:r>
           </w:p>
         </w:tc>
@@ -1776,6 +1846,9 @@
             <w:vAlign w:val="center"/>
           </w:tcPr>
           <w:p>
+            <w:pPr>
+              <w:spacing w:after="0"/>
+            </w:pPr>
             <w:r>
               <w:rPr>
                 <w:rFonts w:ascii="Arial" w:hAnsi="Arial"/>
@@ -1794,6 +1867,7 @@
           </w:tcPr>
           <w:p>
             <w:pPr>
+              <w:spacing w:after="0"/>
               <w:jc w:val="center"/>
             </w:pPr>
           </w:p>
@@ -1805,6 +1879,7 @@
           </w:tcPr>
           <w:p>
             <w:pPr>
+              <w:spacing w:after="0"/>
               <w:jc w:val="center"/>
             </w:pPr>
           </w:p>
@@ -1816,6 +1891,7 @@
           </w:tcPr>
           <w:p>
             <w:pPr>
+              <w:spacing w:after="0"/>
               <w:jc w:val="center"/>
             </w:pPr>
             <w:r>
@@ -1836,6 +1912,7 @@
           </w:tcPr>
           <w:p>
             <w:pPr>
+              <w:spacing w:after="0"/>
               <w:jc w:val="center"/>
             </w:pPr>
           </w:p>
@@ -1847,6 +1924,7 @@
           </w:tcPr>
           <w:p>
             <w:pPr>
+              <w:spacing w:after="0"/>
               <w:jc w:val="center"/>
             </w:pPr>
           </w:p>
@@ -1857,12 +1935,18 @@
             <w:vAlign w:val="center"/>
           </w:tcPr>
           <w:p>
+            <w:pPr>
+              <w:spacing w:after="0"/>
+            </w:pPr>
             <w:r>
               <w:rPr>
                 <w:rFonts w:ascii="Arial" w:hAnsi="Arial"/>
-                <w:sz w:val="15"/>
+                <w:b w:val="0"/>
+                <w:i w:val="0"/>
+                <w:color w:val="17212B"/>
+                <w:sz w:val="16"/>
               </w:rPr>
-              <w:t>Comprendo la separación entre interfaz, API y datos; debo profundizar en arquitectura, despliegue y observabilidad.</w:t>
+              <w:t>Comprendo la separación entre interfaz, API y datos; debo profundizar en arquitectura backend, integración, despliegue y observabilidad.</w:t>
             </w:r>
           </w:p>
         </w:tc>
@@ -1878,6 +1962,9 @@
             <w:vAlign w:val="center"/>
           </w:tcPr>
           <w:p>
+            <w:pPr>
+              <w:spacing w:after="0"/>
+            </w:pPr>
             <w:r>
               <w:rPr>
                 <w:rFonts w:ascii="Arial" w:hAnsi="Arial"/>
@@ -1896,6 +1983,7 @@
           </w:tcPr>
           <w:p>
             <w:pPr>
+              <w:spacing w:after="0"/>
               <w:jc w:val="center"/>
             </w:pPr>
           </w:p>
@@ -1907,6 +1995,7 @@
           </w:tcPr>
           <w:p>
             <w:pPr>
+              <w:spacing w:after="0"/>
               <w:jc w:val="center"/>
             </w:pPr>
           </w:p>
@@ -1918,6 +2007,7 @@
           </w:tcPr>
           <w:p>
             <w:pPr>
+              <w:spacing w:after="0"/>
               <w:jc w:val="center"/>
             </w:pPr>
             <w:r>
@@ -1938,6 +2028,7 @@
           </w:tcPr>
           <w:p>
             <w:pPr>
+              <w:spacing w:after="0"/>
               <w:jc w:val="center"/>
             </w:pPr>
           </w:p>
@@ -1949,6 +2040,7 @@
           </w:tcPr>
           <w:p>
             <w:pPr>
+              <w:spacing w:after="0"/>
               <w:jc w:val="center"/>
             </w:pPr>
           </w:p>
@@ -1959,12 +2051,18 @@
             <w:vAlign w:val="center"/>
           </w:tcPr>
           <w:p>
+            <w:pPr>
+              <w:spacing w:after="0"/>
+            </w:pPr>
             <w:r>
               <w:rPr>
                 <w:rFonts w:ascii="Arial" w:hAnsi="Arial"/>
-                <w:sz w:val="15"/>
+                <w:b w:val="0"/>
+                <w:i w:val="0"/>
+                <w:color w:val="17212B"/>
+                <w:sz w:val="16"/>
               </w:rPr>
-              <w:t>Conozco validaciones y controles de acceso; debo reforzar pruebas automatizadas, análisis de vulnerabilidades y seguridad productiva.</w:t>
+              <w:t>Conozco validaciones y controles de acceso; debo reforzar pruebas automatizadas, seguridad de APIs y análisis de vulnerabilidades.</w:t>
             </w:r>
           </w:p>
         </w:tc>
@@ -1980,6 +2078,9 @@
             <w:vAlign w:val="center"/>
           </w:tcPr>
           <w:p>
+            <w:pPr>
+              <w:spacing w:after="0"/>
+            </w:pPr>
             <w:r>
               <w:rPr>
                 <w:rFonts w:ascii="Arial" w:hAnsi="Arial"/>
@@ -1998,6 +2099,7 @@
           </w:tcPr>
           <w:p>
             <w:pPr>
+              <w:spacing w:after="0"/>
               <w:jc w:val="center"/>
             </w:pPr>
           </w:p>
@@ -2009,6 +2111,7 @@
           </w:tcPr>
           <w:p>
             <w:pPr>
+              <w:spacing w:after="0"/>
               <w:jc w:val="center"/>
             </w:pPr>
             <w:r>
@@ -2029,6 +2132,7 @@
           </w:tcPr>
           <w:p>
             <w:pPr>
+              <w:spacing w:after="0"/>
               <w:jc w:val="center"/>
             </w:pPr>
           </w:p>
@@ -2040,6 +2144,7 @@
           </w:tcPr>
           <w:p>
             <w:pPr>
+              <w:spacing w:after="0"/>
               <w:jc w:val="center"/>
             </w:pPr>
           </w:p>
@@ -2051,6 +2156,7 @@
           </w:tcPr>
           <w:p>
             <w:pPr>
+              <w:spacing w:after="0"/>
               <w:jc w:val="center"/>
             </w:pPr>
           </w:p>
@@ -2061,10 +2167,16 @@
             <w:vAlign w:val="center"/>
           </w:tcPr>
           <w:p>
+            <w:pPr>
+              <w:spacing w:after="0"/>
+            </w:pPr>
             <w:r>
               <w:rPr>
                 <w:rFonts w:ascii="Arial" w:hAnsi="Arial"/>
-                <w:sz w:val="15"/>
+                <w:b w:val="0"/>
+                <w:i w:val="0"/>
+                <w:color w:val="17212B"/>
+                <w:sz w:val="16"/>
               </w:rPr>
               <w:t>Organizo tareas, responsables y seguimiento con Scrum, backlog y Gantt; debo mejorar estimaciones, riesgos y comunicación de cambios.</w:t>
             </w:r>
@@ -2072,26 +2184,6 @@
         </w:tc>
       </w:tr>
     </w:tbl>
-    <w:p>
-      <w:pPr>
-        <w:pStyle w:val="Prrafodelista"/>
-        <w:ind w:left="435"/>
-        <w:rPr>
-          <w:rFonts w:cstheme="minorHAnsi"/>
-          <w:sz w:val="20"/>
-          <w:szCs w:val="20"/>
-        </w:rPr>
-      </w:pPr>
-    </w:p>
-    <w:p>
-      <w:pPr>
-        <w:rPr>
-          <w:rFonts w:cstheme="minorHAnsi"/>
-          <w:sz w:val="20"/>
-          <w:szCs w:val="20"/>
-        </w:rPr>
-      </w:pPr>
-    </w:p>
     <w:sectPr>
       <w:headerReference w:type="even" r:id="rId11"/>
       <w:headerReference w:type="default" r:id="rId12"/>
@@ -2100,7 +2192,7 @@
       <w:headerReference w:type="first" r:id="rId15"/>
       <w:footerReference w:type="first" r:id="rId16"/>
       <w:pgSz w:w="12240" w:h="15840" w:code="1"/>
-      <w:pgMar w:top="1440" w:right="1077" w:bottom="1134" w:left="1077" w:header="567" w:footer="465" w:gutter="0"/>
+      <w:pgMar w:top="1440" w:right="1077" w:bottom="680" w:left="1077" w:header="567" w:footer="465" w:gutter="0"/>
       <w:pgNumType w:start="0"/>
       <w:cols w:space="708"/>
       <w:docGrid w:linePitch="360"/>

</xml_diff>